<commit_message>
Add sorting algorithm docs and update file
Add two new Word docs: ARRAY/Fastest_sorting algorithm.docx and ARRAY/Insertion_sorting.docx, and update ARRAY/Sorting Algorith.docx. These changes add and revise documentation for array sorting algorithms.
</commit_message>
<xml_diff>
--- a/ARRAY/Sorting Algorith.docx
+++ b/ARRAY/Sorting Algorith.docx
@@ -5018,35 +5018,11 @@
     </w:p>
     <w:p>
       <w:pPr>
-        <w:jc w:val="center"/>
         <w:rPr>
           <w:color w:val="FF0000"/>
           <w:sz w:val="44"/>
         </w:rPr>
       </w:pPr>
-      <w:r>
-        <w:rPr>
-          <w:color w:val="FF0000"/>
-          <w:sz w:val="44"/>
-        </w:rPr>
-        <w:t>I have to do it in Paper now</w:t>
-      </w:r>
-    </w:p>
-    <w:p>
-      <w:pPr>
-        <w:jc w:val="center"/>
-        <w:rPr>
-          <w:color w:val="FF0000"/>
-          <w:sz w:val="44"/>
-        </w:rPr>
-      </w:pPr>
-      <w:r>
-        <w:rPr>
-          <w:color w:val="FF0000"/>
-          <w:sz w:val="44"/>
-        </w:rPr>
-        <w:t>Do the other partition also</w:t>
-      </w:r>
       <w:bookmarkStart w:id="0" w:name="_GoBack"/>
       <w:bookmarkEnd w:id="0"/>
     </w:p>
@@ -7532,8 +7508,8 @@
       <w:szCs w:val="20"/>
     </w:rPr>
   </w:style>
-  <w:style w:type="character" w:customStyle="1" w:styleId="strong0">
-    <w:name w:val="strong"/>
+  <w:style w:type="character" w:customStyle="1" w:styleId="Strong1">
+    <w:name w:val="Strong1"/>
     <w:basedOn w:val="DefaultParagraphFont"/>
     <w:rsid w:val="000769F8"/>
   </w:style>

</xml_diff>